<commit_message>
TOR: add Netlify link, tighten front matter, add PDF export
- Website link https://aimaximus.netlify.app/ in intro and deliverables
- Remove extra blank lines in template front matter so the PDF paginates
  as the template intends (intro on page 6); TOC page numbers match
- Add PDF version and include both TOR files in the submission zip

Co-Authored-By: Claude Opus 5.5 <noreply@anthropic.com>
Claude-Session: https://claude.ai/code/session_014KhJJMBLMJ4bq7S4Nx9dBm
</commit_message>
<xml_diff>
--- a/TOR/mini_proj1_1680703947_1680704473.docx
+++ b/TOR/mini_proj1_1680703947_1680704473.docx
@@ -359,126 +359,6 @@
           <w:szCs w:val="32"/>
         </w:rPr>
       </w:pPr>
-    </w:p>
-    <w:p>
-      <w:pPr>
-        <w:rPr>
-          <w:rFonts w:ascii="TH Sarabun New" w:hAnsi="TH Sarabun New" w:cs="TH Sarabun New"/>
-          <w:sz w:val="32"/>
-          <w:szCs w:val="32"/>
-        </w:rPr>
-      </w:pPr>
-    </w:p>
-    <w:p>
-      <w:pPr>
-        <w:rPr>
-          <w:rFonts w:ascii="TH Sarabun New" w:hAnsi="TH Sarabun New" w:cs="TH Sarabun New"/>
-          <w:sz w:val="32"/>
-          <w:szCs w:val="32"/>
-        </w:rPr>
-      </w:pPr>
-    </w:p>
-    <w:p>
-      <w:pPr>
-        <w:rPr>
-          <w:rFonts w:ascii="TH Sarabun New" w:hAnsi="TH Sarabun New" w:cs="TH Sarabun New"/>
-          <w:sz w:val="32"/>
-          <w:szCs w:val="32"/>
-        </w:rPr>
-      </w:pPr>
-    </w:p>
-    <w:p>
-      <w:pPr>
-        <w:rPr>
-          <w:rFonts w:ascii="TH Sarabun New" w:hAnsi="TH Sarabun New" w:cs="TH Sarabun New"/>
-          <w:sz w:val="32"/>
-          <w:szCs w:val="32"/>
-        </w:rPr>
-      </w:pPr>
-    </w:p>
-    <w:p>
-      <w:pPr>
-        <w:rPr>
-          <w:rFonts w:ascii="TH Sarabun New" w:hAnsi="TH Sarabun New" w:cs="TH Sarabun New"/>
-          <w:sz w:val="32"/>
-          <w:szCs w:val="32"/>
-        </w:rPr>
-      </w:pPr>
-    </w:p>
-    <w:p>
-      <w:pPr>
-        <w:rPr>
-          <w:rFonts w:ascii="TH Sarabun New" w:hAnsi="TH Sarabun New" w:cs="TH Sarabun New"/>
-          <w:sz w:val="32"/>
-          <w:szCs w:val="32"/>
-        </w:rPr>
-      </w:pPr>
-    </w:p>
-    <w:p>
-      <w:pPr>
-        <w:rPr>
-          <w:rFonts w:ascii="TH Sarabun New" w:hAnsi="TH Sarabun New" w:cs="TH Sarabun New"/>
-          <w:sz w:val="32"/>
-          <w:szCs w:val="32"/>
-        </w:rPr>
-      </w:pPr>
-    </w:p>
-    <w:p>
-      <w:pPr>
-        <w:rPr>
-          <w:rFonts w:ascii="TH Sarabun New" w:hAnsi="TH Sarabun New" w:cs="TH Sarabun New"/>
-          <w:sz w:val="32"/>
-          <w:szCs w:val="32"/>
-        </w:rPr>
-      </w:pPr>
-    </w:p>
-    <w:p>
-      <w:pPr>
-        <w:rPr>
-          <w:rFonts w:ascii="TH Sarabun New" w:hAnsi="TH Sarabun New" w:cs="TH Sarabun New"/>
-          <w:sz w:val="32"/>
-          <w:szCs w:val="32"/>
-        </w:rPr>
-      </w:pPr>
-    </w:p>
-    <w:p>
-      <w:pPr>
-        <w:rPr>
-          <w:rFonts w:ascii="TH Sarabun New" w:hAnsi="TH Sarabun New" w:cs="TH Sarabun New"/>
-          <w:sz w:val="32"/>
-          <w:szCs w:val="32"/>
-        </w:rPr>
-      </w:pPr>
-    </w:p>
-    <w:p>
-      <w:pPr>
-        <w:rPr>
-          <w:rFonts w:ascii="TH Sarabun New" w:hAnsi="TH Sarabun New" w:cs="TH Sarabun New"/>
-          <w:sz w:val="32"/>
-          <w:szCs w:val="32"/>
-        </w:rPr>
-      </w:pPr>
-    </w:p>
-    <w:p>
-      <w:pPr>
-        <w:tabs>
-          <w:tab w:val="center" w:pos="4935"/>
-        </w:tabs>
-        <w:rPr>
-          <w:rFonts w:ascii="TH Sarabun New" w:hAnsi="TH Sarabun New" w:cs="TH Sarabun New"/>
-          <w:sz w:val="32"/>
-          <w:szCs w:val="32"/>
-        </w:rPr>
-      </w:pPr>
-      <w:r>
-        <w:rPr>
-          <w:rFonts w:ascii="TH Sarabun New" w:hAnsi="TH Sarabun New" w:cs="TH Sarabun New"/>
-          <w:sz w:val="32"/>
-          <w:szCs w:val="32"/>
-        </w:rPr>
-        <w:lastRenderedPageBreak/>
-        <w:tab/>
-      </w:r>
     </w:p>
     <w:p>
       <w:pPr>
@@ -872,45 +752,6 @@
           <w:szCs w:val="32"/>
         </w:rPr>
       </w:pPr>
-    </w:p>
-    <w:p>
-      <w:pPr>
-        <w:tabs>
-          <w:tab w:val="left" w:pos="2977"/>
-          <w:tab w:val="left" w:pos="8080"/>
-        </w:tabs>
-        <w:rPr>
-          <w:rFonts w:ascii="TH Sarabun New" w:hAnsi="TH Sarabun New" w:cs="TH Sarabun New"/>
-          <w:sz w:val="32"/>
-          <w:szCs w:val="32"/>
-        </w:rPr>
-      </w:pPr>
-    </w:p>
-    <w:p>
-      <w:pPr>
-        <w:tabs>
-          <w:tab w:val="left" w:pos="2977"/>
-          <w:tab w:val="left" w:pos="8080"/>
-        </w:tabs>
-        <w:rPr>
-          <w:rFonts w:ascii="TH Sarabun New" w:hAnsi="TH Sarabun New" w:cs="TH Sarabun New"/>
-          <w:sz w:val="32"/>
-          <w:szCs w:val="32"/>
-        </w:rPr>
-      </w:pPr>
-    </w:p>
-    <w:p>
-      <w:pPr>
-        <w:tabs>
-          <w:tab w:val="left" w:pos="2977"/>
-          <w:tab w:val="left" w:pos="8080"/>
-        </w:tabs>
-        <w:rPr>
-          <w:rFonts w:ascii="TH Sarabun New" w:hAnsi="TH Sarabun New" w:cs="TH Sarabun New"/>
-          <w:sz w:val="32"/>
-          <w:szCs w:val="32"/>
-        </w:rPr>
-      </w:pPr>
       <w:r>
         <w:rPr>
           <w:rFonts w:ascii="TH Sarabun New" w:hAnsi="TH Sarabun New" w:cs="TH Sarabun New"/>
@@ -1635,16 +1476,6 @@
                 <w:rFonts w:ascii="TH Sarabun New" w:hAnsi="TH Sarabun New" w:cs="TH Sarabun New"/>
                 <w:sz w:val="32"/>
                 <w:szCs w:val="32"/>
-              </w:rPr>
-            </w:pPr>
-          </w:p>
-          <w:p>
-            <w:pPr>
-              <w:jc w:val="center"/>
-              <w:rPr>
-                <w:rFonts w:ascii="TH Sarabun New" w:hAnsi="TH Sarabun New" w:cs="TH Sarabun New"/>
-                <w:sz w:val="32"/>
-                <w:szCs w:val="32"/>
                 <w:lang w:bidi="th-TH"/>
               </w:rPr>
             </w:pPr>
@@ -1675,17 +1506,6 @@
                 <w:lang w:bidi="th-TH"/>
               </w:rPr>
             </w:pPr>
-          </w:p>
-          <w:p>
-            <w:pPr>
-              <w:jc w:val="center"/>
-              <w:rPr>
-                <w:rFonts w:ascii="TH Sarabun New" w:hAnsi="TH Sarabun New" w:cs="TH Sarabun New"/>
-                <w:sz w:val="32"/>
-                <w:szCs w:val="32"/>
-                <w:lang w:bidi="th-TH"/>
-              </w:rPr>
-            </w:pPr>
             <w:r>
               <w:rPr>
                 <w:rFonts w:ascii="TH Sarabun New" w:hAnsi="TH Sarabun New" w:cs="TH Sarabun New" w:hint="cs"/>
@@ -1741,17 +1561,6 @@
                 <w:lang w:bidi="th-TH"/>
               </w:rPr>
             </w:pPr>
-          </w:p>
-          <w:p>
-            <w:pPr>
-              <w:jc w:val="center"/>
-              <w:rPr>
-                <w:rFonts w:ascii="TH Sarabun New" w:hAnsi="TH Sarabun New" w:cs="TH Sarabun New"/>
-                <w:sz w:val="32"/>
-                <w:szCs w:val="32"/>
-                <w:lang w:bidi="th-TH"/>
-              </w:rPr>
-            </w:pPr>
             <w:r>
               <w:rPr>
                 <w:rFonts w:ascii="TH Sarabun New" w:hAnsi="TH Sarabun New" w:cs="TH Sarabun New"/>
@@ -1786,16 +1595,6 @@
                 <w:szCs w:val="32"/>
               </w:rPr>
             </w:pPr>
-          </w:p>
-          <w:p>
-            <w:pPr>
-              <w:jc w:val="center"/>
-              <w:rPr>
-                <w:rFonts w:ascii="TH Sarabun New" w:hAnsi="TH Sarabun New" w:cs="TH Sarabun New"/>
-                <w:sz w:val="32"/>
-                <w:szCs w:val="32"/>
-              </w:rPr>
-            </w:pPr>
             <w:r>
               <w:rPr>
                 <w:rFonts w:ascii="TH Sarabun New" w:hAnsi="TH Sarabun New" w:cs="TH Sarabun New"/>
@@ -1820,16 +1619,6 @@
                 <w:szCs w:val="32"/>
               </w:rPr>
             </w:pPr>
-          </w:p>
-          <w:p>
-            <w:pPr>
-              <w:jc w:val="center"/>
-              <w:rPr>
-                <w:rFonts w:ascii="TH Sarabun New" w:hAnsi="TH Sarabun New" w:cs="TH Sarabun New"/>
-                <w:sz w:val="32"/>
-                <w:szCs w:val="32"/>
-              </w:rPr>
-            </w:pPr>
             <w:r>
               <w:rPr>
                 <w:rFonts w:ascii="TH Sarabun New" w:hAnsi="TH Sarabun New" w:cs="TH Sarabun New"/>
@@ -1855,17 +1644,6 @@
                 <w:szCs w:val="32"/>
               </w:rPr>
             </w:pPr>
-          </w:p>
-          <w:p>
-            <w:pPr>
-              <w:ind w:right="-192"/>
-              <w:jc w:val="center"/>
-              <w:rPr>
-                <w:rFonts w:ascii="TH Sarabun New" w:hAnsi="TH Sarabun New" w:cs="TH Sarabun New"/>
-                <w:sz w:val="32"/>
-                <w:szCs w:val="32"/>
-              </w:rPr>
-            </w:pPr>
             <w:r>
               <w:rPr>
                 <w:rFonts w:ascii="TH Sarabun New" w:hAnsi="TH Sarabun New" w:cs="TH Sarabun New"/>
@@ -1884,17 +1662,6 @@
           <w:p>
             <w:pPr>
               <w:ind w:right="-192"/>
-              <w:jc w:val="center"/>
-              <w:rPr>
-                <w:rFonts w:ascii="TH Sarabun New" w:hAnsi="TH Sarabun New" w:cs="TH Sarabun New"/>
-                <w:sz w:val="32"/>
-                <w:szCs w:val="32"/>
-              </w:rPr>
-            </w:pPr>
-          </w:p>
-          <w:p>
-            <w:pPr>
-              <w:ind w:right="-192"/>
               <w:rPr>
                 <w:rFonts w:ascii="TH Sarabun New" w:hAnsi="TH Sarabun New" w:cs="TH Sarabun New"/>
                 <w:sz w:val="32"/>
@@ -1911,149 +1678,6 @@
               </w:rPr>
               <w:t xml:space="preserve">จัดทำข้อกำหนดโครงการเว็บไซต์ AI MAXIMUS (รับสมัครงานและหลักสูตรอบรมด้าน AI)</w:t>
             </w:r>
-          </w:p>
-          <w:p>
-            <w:pPr>
-              <w:ind w:right="-192"/>
-              <w:jc w:val="center"/>
-              <w:rPr>
-                <w:rFonts w:ascii="TH Sarabun New" w:hAnsi="TH Sarabun New" w:cs="TH Sarabun New"/>
-                <w:sz w:val="32"/>
-                <w:szCs w:val="32"/>
-              </w:rPr>
-            </w:pPr>
-          </w:p>
-          <w:p>
-            <w:pPr>
-              <w:ind w:right="-192"/>
-              <w:jc w:val="center"/>
-              <w:rPr>
-                <w:rFonts w:ascii="TH Sarabun New" w:hAnsi="TH Sarabun New" w:cs="TH Sarabun New"/>
-                <w:sz w:val="32"/>
-                <w:szCs w:val="32"/>
-              </w:rPr>
-            </w:pPr>
-          </w:p>
-          <w:p>
-            <w:pPr>
-              <w:ind w:right="-192"/>
-              <w:jc w:val="center"/>
-              <w:rPr>
-                <w:rFonts w:ascii="TH Sarabun New" w:hAnsi="TH Sarabun New" w:cs="TH Sarabun New"/>
-                <w:sz w:val="32"/>
-                <w:szCs w:val="32"/>
-              </w:rPr>
-            </w:pPr>
-          </w:p>
-          <w:p>
-            <w:pPr>
-              <w:ind w:right="-192"/>
-              <w:jc w:val="center"/>
-              <w:rPr>
-                <w:rFonts w:ascii="TH Sarabun New" w:hAnsi="TH Sarabun New" w:cs="TH Sarabun New"/>
-                <w:sz w:val="32"/>
-                <w:szCs w:val="32"/>
-              </w:rPr>
-            </w:pPr>
-          </w:p>
-          <w:p>
-            <w:pPr>
-              <w:ind w:right="-192"/>
-              <w:jc w:val="center"/>
-              <w:rPr>
-                <w:rFonts w:ascii="TH Sarabun New" w:hAnsi="TH Sarabun New" w:cs="TH Sarabun New"/>
-                <w:sz w:val="32"/>
-                <w:szCs w:val="32"/>
-              </w:rPr>
-            </w:pPr>
-          </w:p>
-          <w:p>
-            <w:pPr>
-              <w:ind w:right="-192"/>
-              <w:jc w:val="center"/>
-              <w:rPr>
-                <w:rFonts w:ascii="TH Sarabun New" w:hAnsi="TH Sarabun New" w:cs="TH Sarabun New"/>
-                <w:sz w:val="32"/>
-                <w:szCs w:val="32"/>
-              </w:rPr>
-            </w:pPr>
-          </w:p>
-          <w:p>
-            <w:pPr>
-              <w:ind w:right="-192"/>
-              <w:jc w:val="center"/>
-              <w:rPr>
-                <w:rFonts w:ascii="TH Sarabun New" w:hAnsi="TH Sarabun New" w:cs="TH Sarabun New"/>
-                <w:sz w:val="32"/>
-                <w:szCs w:val="32"/>
-              </w:rPr>
-            </w:pPr>
-          </w:p>
-          <w:p>
-            <w:pPr>
-              <w:ind w:right="-192"/>
-              <w:jc w:val="center"/>
-              <w:rPr>
-                <w:rFonts w:ascii="TH Sarabun New" w:hAnsi="TH Sarabun New" w:cs="TH Sarabun New"/>
-                <w:sz w:val="32"/>
-                <w:szCs w:val="32"/>
-              </w:rPr>
-            </w:pPr>
-          </w:p>
-          <w:p>
-            <w:pPr>
-              <w:ind w:right="-192"/>
-              <w:jc w:val="center"/>
-              <w:rPr>
-                <w:rFonts w:ascii="TH Sarabun New" w:hAnsi="TH Sarabun New" w:cs="TH Sarabun New"/>
-                <w:sz w:val="32"/>
-                <w:szCs w:val="32"/>
-              </w:rPr>
-            </w:pPr>
-          </w:p>
-          <w:p>
-            <w:pPr>
-              <w:ind w:right="-192"/>
-              <w:jc w:val="center"/>
-              <w:rPr>
-                <w:rFonts w:ascii="TH Sarabun New" w:hAnsi="TH Sarabun New" w:cs="TH Sarabun New"/>
-                <w:sz w:val="32"/>
-                <w:szCs w:val="32"/>
-              </w:rPr>
-            </w:pPr>
-          </w:p>
-          <w:p>
-            <w:pPr>
-              <w:ind w:right="-192"/>
-              <w:jc w:val="center"/>
-              <w:rPr>
-                <w:rFonts w:ascii="TH Sarabun New" w:hAnsi="TH Sarabun New" w:cs="TH Sarabun New"/>
-                <w:sz w:val="32"/>
-                <w:szCs w:val="32"/>
-              </w:rPr>
-            </w:pPr>
-          </w:p>
-          <w:p>
-            <w:pPr>
-              <w:ind w:right="-192"/>
-              <w:jc w:val="center"/>
-              <w:rPr>
-                <w:rFonts w:ascii="TH Sarabun New" w:hAnsi="TH Sarabun New" w:cs="TH Sarabun New"/>
-                <w:sz w:val="32"/>
-                <w:szCs w:val="32"/>
-              </w:rPr>
-            </w:pPr>
-          </w:p>
-          <w:p>
-            <w:pPr>
-              <w:ind w:right="-192"/>
-              <w:jc w:val="center"/>
-              <w:rPr>
-                <w:rFonts w:ascii="TH Sarabun New" w:hAnsi="TH Sarabun New" w:cs="TH Sarabun New"/>
-                <w:sz w:val="32"/>
-                <w:szCs w:val="32"/>
-              </w:rPr>
-            </w:pPr>
           </w:p>
         </w:tc>
       </w:tr>
@@ -2903,7 +2527,18 @@
           <w:szCs w:val="32"/>
           <w:lang w:bidi="th-TH"/>
         </w:rPr>
-        <w:t xml:space="preserve"> และมีหน้าเว็บให้ข้อมูลประชาสัมพันธ์ ตําแหน่งงานที่รับสมัคร (5 ตำแหน่ง พร้อมหน้ารายละเอียดของแต่ละตำแหน่ง) แบบฟอร์มสมัครงานที่ตรวจสอบความถูกต้องของข้อมูลด้วย JavaScript และหลักสูตรพัฒนาศักยภาพตนเองด้าน AI จำนวน 10 หลักสูตร ตั้งแต่ระดับพื้นฐานจนถึงระดับสูง</w:t>
+        <w:t xml:space="preserve"> และมีหน้าเว็บให้ข้อมูลประชาสัมพันธ์ ตําแหน่งงานที่รับสมัคร (5 ตำแหน่ง พร้อมหน้ารายละเอียดของแต่ละตำแหน่ง) แบบฟอร์มสมัครงานที่ตรวจสอบความถูกต้องของข้อมูลด้วย JavaScript และหลักสูตรพัฒนาศักยภาพตนเองด้าน AI จำนวน 10 หลักสูตร ตั้งแต่ระดับพื้นฐานจนถึงระดับสูง ทั้งนี้ได้ Deploy เว็บไซต์ไว้ที่ </w:t>
+      </w:r>
+      <w:r>
+        <w:rPr>
+          <w:rFonts w:ascii="TH Sarabun New" w:hAnsi="TH Sarabun New" w:cs="TH Sarabun New"/>
+          <w:b/>
+          <w:bCs/>
+          <w:sz w:val="32"/>
+          <w:szCs w:val="32"/>
+          <w:lang w:bidi="th-TH"/>
+        </w:rPr>
+        <w:t xml:space="preserve">https://aimaximus.netlify.app/</w:t>
       </w:r>
     </w:p>
     <w:p>
@@ -14083,10 +13718,9 @@
           <w:rFonts w:ascii="TH Sarabun New" w:hAnsi="TH Sarabun New" w:cs="TH Sarabun New"/>
           <w:sz w:val="32"/>
           <w:szCs w:val="32"/>
-          <w:highlight w:val="yellow"/>
-          <w:lang w:bidi="th-TH"/>
-        </w:rPr>
-        <w:t xml:space="preserve">https://..........................................</w:t>
+          <w:lang w:bidi="th-TH"/>
+        </w:rPr>
+        <w:t xml:space="preserve">https://aimaximus.netlify.app/</w:t>
       </w:r>
     </w:p>
     <w:p>

</xml_diff>

<commit_message>
TOR: fit mobile/tablet screenshots inside their table cells
The tablet image (3.4in) was wider than its 3.1in cell and got cropped
in PDF viewers. Columns are now 2.5in/3.75in with images sized to fit.

Co-Authored-By: Claude Opus 5.5 <noreply@anthropic.com>
Claude-Session: https://claude.ai/code/session_014KhJJMBLMJ4bq7S4Nx9dBm
</commit_message>
<xml_diff>
--- a/TOR/mini_proj1_1680703947_1680704473.docx
+++ b/TOR/mini_proj1_1680703947_1680704473.docx
@@ -11219,8 +11219,8 @@
         <w:tblLayout w:type="fixed"/>
       </w:tblPr>
       <w:tblGrid>
-        <w:gridCol w:w="4500"/>
-        <w:gridCol w:w="4500"/>
+        <w:gridCol w:w="3600"/>
+        <w:gridCol w:w="5400"/>
       </w:tblGrid>
       <w:tr>
         <w:trPr>
@@ -11228,7 +11228,7 @@
         </w:trPr>
         <w:tc>
           <w:tcPr>
-            <w:tcW w:w="4500" w:type="dxa"/>
+            <w:tcW w:w="3600" w:type="dxa"/>
           </w:tcPr>
           <w:p>
             <w:pPr>
@@ -11244,7 +11244,7 @@
             <w:r>
               <w:drawing>
                 <wp:inline distT="0" distB="0" distL="0" distR="0">
-                  <wp:extent cx="2103120" cy="4551367"/>
+                  <wp:extent cx="1920240" cy="4155596"/>
                   <wp:docPr id="2014" name="Picture 2014"/>
                   <wp:cNvGraphicFramePr>
                     <a:graphicFrameLocks xmlns:a="http://schemas.openxmlformats.org/drawingml/2006/main" noChangeAspect="1"/>
@@ -11265,7 +11265,7 @@
                         <pic:spPr>
                           <a:xfrm>
                             <a:off x="0" y="0"/>
-                            <a:ext cx="2103120" cy="4551367"/>
+                            <a:ext cx="1920240" cy="4155596"/>
                           </a:xfrm>
                           <a:prstGeom prst="rect">
                             <a:avLst/>
@@ -11301,13 +11301,13 @@
                 <w:szCs w:val="26"/>
                 <w:lang w:bidi="th-TH"/>
               </w:rPr>
-              <w:t xml:space="preserve">Mobile (390 px) – เปิดเมนู Hamburger</w:t>
+              <w:t xml:space="preserve">Mobile (390 px)</w:t>
             </w:r>
           </w:p>
         </w:tc>
         <w:tc>
           <w:tcPr>
-            <w:tcW w:w="4500" w:type="dxa"/>
+            <w:tcW w:w="5400" w:type="dxa"/>
           </w:tcPr>
           <w:p>
             <w:pPr>
@@ -11323,7 +11323,7 @@
             <w:r>
               <w:drawing>
                 <wp:inline distT="0" distB="0" distL="0" distR="0">
-                  <wp:extent cx="3108960" cy="4473869"/>
+                  <wp:extent cx="3017520" cy="4342284"/>
                   <wp:docPr id="2015" name="Picture 2015"/>
                   <wp:cNvGraphicFramePr>
                     <a:graphicFrameLocks xmlns:a="http://schemas.openxmlformats.org/drawingml/2006/main" noChangeAspect="1"/>
@@ -11344,7 +11344,7 @@
                         <pic:spPr>
                           <a:xfrm>
                             <a:off x="0" y="0"/>
-                            <a:ext cx="3108960" cy="4473869"/>
+                            <a:ext cx="3017520" cy="4342284"/>
                           </a:xfrm>
                           <a:prstGeom prst="rect">
                             <a:avLst/>
@@ -11406,7 +11406,7 @@
           <w:szCs w:val="28"/>
           <w:lang w:bidi="th-TH"/>
         </w:rPr>
-        <w:t xml:space="preserve">ภาพที่ 14 ตัวอย่างการแสดงผลหน้าแรกบน Mobile และ Tablet</w:t>
+        <w:t xml:space="preserve">ภาพที่ 14 ตัวอย่างการแสดงผลหน้าแรกบน Mobile (เปิดเมนู Hamburger) และ Tablet</w:t>
       </w:r>
     </w:p>
     <w:p>

</xml_diff>